<commit_message>
Initial clean commit with virtual environment ignored
</commit_message>
<xml_diff>
--- a/Mass_Booklet_Imposed.docx
+++ b/Mass_Booklet_Imposed.docx
@@ -48,103 +48,6 @@
         <w:br/>
       </w:r>
     </w:p>
-    <w:p>
-      <w:pPr>
-        <w:tabs>
-          <w:tab w:pos="6336" w:val="right"/>
-        </w:tabs>
-        <w:spacing w:before="80" w:after="40"/>
-      </w:pPr>
-      <w:r>
-        <w:rPr>
-          <w:b/>
-          <w:color w:val="000000"/>
-          <w:sz w:val="21"/>
-        </w:rPr>
-        <w:t>COMMUNION HYMN / THÁNH CA HIỆP LỄ</w:t>
-      </w:r>
-    </w:p>
-    <w:p>
-      <w:pPr>
-        <w:spacing w:after="40"/>
-      </w:pPr>
-      <w:r>
-        <w:rPr>
-          <w:b/>
-          <w:sz w:val="19"/>
-        </w:rPr>
-        <w:t>Thánh Ca: Con Thờ Lạy Chúa</w:t>
-      </w:r>
-    </w:p>
-    <w:p>
-      <w:pPr>
-        <w:spacing w:after="80"/>
-      </w:pPr>
-      <w:r>
-        <w:rPr>
-          <w:b/>
-          <w:sz w:val="19"/>
-        </w:rPr>
-        <w:t>ĐK. Chúa ơi con tin có Chúa ngự nơi đây...</w:t>
-      </w:r>
-    </w:p>
-    <w:p>
-      <w:pPr>
-        <w:spacing w:after="80" w:before="0"/>
-        <w:ind w:left="216"/>
-      </w:pPr>
-      <w:r>
-        <w:rPr>
-          <w:sz w:val="19"/>
-        </w:rPr>
-        <w:t>1. Dù ngàn gian khó con không sợ gì vì Chúa ở cùng con...</w:t>
-      </w:r>
-    </w:p>
-    <w:p/>
-    <w:p>
-      <w:pPr>
-        <w:tabs>
-          <w:tab w:pos="6336" w:val="right"/>
-        </w:tabs>
-        <w:spacing w:before="80" w:after="40"/>
-      </w:pPr>
-      <w:r>
-        <w:rPr>
-          <w:b/>
-          <w:color w:val="000000"/>
-          <w:sz w:val="21"/>
-        </w:rPr>
-        <w:t>RECESSIONAL HYMN / THÁNH CA KẾT LỄ</w:t>
-      </w:r>
-    </w:p>
-    <w:p>
-      <w:pPr>
-        <w:spacing w:after="40"/>
-      </w:pPr>
-      <w:r>
-        <w:rPr>
-          <w:b/>
-          <w:sz w:val="19"/>
-        </w:rPr>
-        <w:t>Thánh Ca: Salve Regina</w:t>
-      </w:r>
-    </w:p>
-    <w:p>
-      <w:pPr>
-        <w:spacing w:after="80"/>
-      </w:pPr>
-      <w:r>
-        <w:rPr>
-          <w:sz w:val="19"/>
-        </w:rPr>
-        <w:t>Salve, Regina, mater misericordiae, vita, dulcedo, et spes nostra, salve.</w:t>
-        <w:br/>
-        <w:t>Ad te clamamus, exsules filii Hevae.</w:t>
-        <w:br/>
-        <w:t>Eia, ergo, advocata nostra, illos tuos misericordes oculos ad nos converte.</w:t>
-      </w:r>
-    </w:p>
-    <w:p/>
     <w:p/>
     <w:p>
       <w:r>
@@ -161,7 +64,7 @@
           <w:color w:val="646464"/>
           <w:sz w:val="24"/>
         </w:rPr>
-        <w:t>ĐOÀN ANÊ THÀNH</w:t>
+        <w:t>ORGANIZATION</w:t>
         <w:br/>
       </w:r>
       <w:r>
@@ -169,14 +72,14 @@
           <w:b/>
           <w:sz w:val="28"/>
         </w:rPr>
-        <w:t>Hike &amp; Mass at Discovery Park</w:t>
+        <w:t>Mass Booklet</w:t>
         <w:br/>
       </w:r>
       <w:r>
         <w:rPr>
           <w:sz w:val="23"/>
         </w:rPr>
-        <w:t>Friday of the Eighteenth Week in Ordinary Time</w:t>
+        <w:t>Memorial of Saint Thérèse of the Child Jesus, Virgin and Doctor of the Church</w:t>
         <w:br/>
       </w:r>
       <w:r>
@@ -184,76 +87,11 @@
           <w:i/>
           <w:sz w:val="20"/>
         </w:rPr>
-        <w:t>August 07, 2026</w:t>
+        <w:t>October 01, 2026</w:t>
         <w:br/>
         <w:br/>
       </w:r>
     </w:p>
-    <w:p>
-      <w:pPr>
-        <w:tabs>
-          <w:tab w:pos="6336" w:val="right"/>
-        </w:tabs>
-        <w:spacing w:before="80" w:after="40"/>
-      </w:pPr>
-      <w:r>
-        <w:rPr>
-          <w:b/>
-          <w:color w:val="000000"/>
-          <w:sz w:val="21"/>
-        </w:rPr>
-        <w:t>OPENING HYMN / THÁNH CA NHẬP LỄ</w:t>
-      </w:r>
-    </w:p>
-    <w:p>
-      <w:pPr>
-        <w:spacing w:after="40"/>
-      </w:pPr>
-      <w:r>
-        <w:rPr>
-          <w:b/>
-          <w:sz w:val="19"/>
-        </w:rPr>
-        <w:t>Thánh Ca: Khúc Ca Mở Lễ</w:t>
-      </w:r>
-    </w:p>
-    <w:p>
-      <w:pPr>
-        <w:spacing w:after="80"/>
-      </w:pPr>
-      <w:r>
-        <w:rPr>
-          <w:b/>
-          <w:sz w:val="19"/>
-        </w:rPr>
-        <w:t>ĐK. Xin hồng ân Chúa tràn trề trên đoàn con bước vào nhà Chúa...</w:t>
-      </w:r>
-    </w:p>
-    <w:p>
-      <w:pPr>
-        <w:spacing w:after="80" w:before="0"/>
-        <w:ind w:left="216"/>
-      </w:pPr>
-      <w:r>
-        <w:rPr>
-          <w:sz w:val="19"/>
-        </w:rPr>
-        <w:t>1. Đoàn con tiến bước về đền thánh Ngài, hòa tiếng hát dâng ngàn lời ca...</w:t>
-      </w:r>
-    </w:p>
-    <w:p>
-      <w:pPr>
-        <w:spacing w:after="80" w:before="0"/>
-        <w:ind w:left="216"/>
-      </w:pPr>
-      <w:r>
-        <w:rPr>
-          <w:sz w:val="19"/>
-        </w:rPr>
-        <w:t>2. Nguyện xin dâng tiến muôn vàn tâm tư, cùng năm tháng sống đượm tình mến yêu...</w:t>
-      </w:r>
-    </w:p>
-    <w:p/>
     <w:p>
       <w:r>
         <w:br w:type="page"/>
@@ -274,6 +112,18 @@
         </w:rPr>
         <w:t>READING 1 / BÀI ĐỌC I</w:t>
       </w:r>
+      <w:r>
+        <w:tab/>
+      </w:r>
+      <w:r>
+        <w:rPr>
+          <w:b w:val="0"/>
+          <w:i w:val="0"/>
+          <w:color w:val="505050"/>
+          <w:sz w:val="19"/>
+        </w:rPr>
+        <w:t>Job 19:21-27</w:t>
+      </w:r>
     </w:p>
     <w:p>
       <w:pPr>
@@ -283,9 +133,7 @@
         <w:rPr>
           <w:sz w:val="19"/>
         </w:rPr>
-        <w:t>Nahum 2:1, 3; 3:1-3, 6-7</w:t>
-        <w:br/>
-        <w:t>See, upon the mountains there advances the bearer of good news, announcing peace! Celebrate your feasts, O Judah, fulfill your vows! For nevermore shall you be invaded by the scoundrel; he is completely destroyed. The LORD will restore the vine of Jacob, the pride of Israel, Though ravagers have ravaged them and ruined the tendrils.Woe to the bloody city, all lies, full of plunder, whose looting never stops! The crack of the whip, the rumbling sounds of wheels; horses a-gallop, chariots bounding, Cavalry charging, the flame of the sword, the flash of the spear, the many slain, the heaping corpses, the endless bodies to stumble upon! I will cast filth upon you, disgrace you and put you to shame; Till everyone who sees you runs from you, saying, “Nineveh is destroyed; who can pity her? Where can one find any to console her?”</w:t>
+        <w:t>Job said: Pity me, pity me, O you my friends, for the hand of God has struck me! Why do you hound me as though you were divine, and insatiably prey upon me? Oh, would that my words were written down! Would that they were inscribed in a record: That with an iron chisel and with lead they were cut in the rock forever! But as for me, I know that my Vindicator lives, and that he will at last stand forth upon the dust; Whom I myself shall see: my own eyes, not another’s, shall behold him, And from my flesh I shall see God; my inmost being is consumed with longing.</w:t>
       </w:r>
     </w:p>
     <w:p/>
@@ -314,7 +162,7 @@
           <w:color w:val="505050"/>
           <w:sz w:val="19"/>
         </w:rPr>
-        <w:t>Deuteronomy 32:35cd-36ab, 39abcd, 41</w:t>
+        <w:t>Psalm 27:7-8a, 8b-9abc, 13-14</w:t>
       </w:r>
     </w:p>
     <w:p>
@@ -326,7 +174,7 @@
           <w:b/>
           <w:sz w:val="19"/>
         </w:rPr>
-        <w:t>R. (39c) It is I who deal death and give life.</w:t>
+        <w:t>R. (13) I believe that I shall see the good things of the Lord in the land of the living.</w:t>
       </w:r>
     </w:p>
     <w:p>
@@ -338,7 +186,7 @@
         <w:rPr>
           <w:sz w:val="19"/>
         </w:rPr>
-        <w:t xml:space="preserve">1. Close at hand is the day of their disaster, and their doom is rushing upon them! Surely, the LORD shall do justice for his people; on his servants he shall have pity. </w:t>
+        <w:t xml:space="preserve">1. Hear, O LORD, the sound of my call; have pity on me, and answer me. Of you my heart speaks; you my glance seeks. </w:t>
       </w:r>
       <w:r>
         <w:rPr>
@@ -357,7 +205,7 @@
         <w:rPr>
           <w:sz w:val="19"/>
         </w:rPr>
-        <w:t xml:space="preserve">2. “Learn then that I, I alone, am God, and there is no god besides me. It is I who bring both death and life, I who inflict wounds and heal them.” </w:t>
+        <w:t xml:space="preserve">2. Your presence, O LORD, I seek. Hide not your face from me; do not in anger repel your servant. You are my helper: cast me not off. </w:t>
       </w:r>
       <w:r>
         <w:rPr>
@@ -376,7 +224,7 @@
         <w:rPr>
           <w:sz w:val="19"/>
         </w:rPr>
-        <w:t xml:space="preserve">3. I will sharpen my flashing sword, and my hand shall lay hold of my quiver, “With vengeance I will repay my foes and requite those who hate me.” </w:t>
+        <w:t xml:space="preserve">3. I believe that I shall see the bounty of the LORD in the land of the living. Wait for the LORD with courage; be stouthearted, and wait for the LORD. </w:t>
       </w:r>
       <w:r>
         <w:rPr>
@@ -416,7 +264,7 @@
           <w:color w:val="505050"/>
           <w:sz w:val="19"/>
         </w:rPr>
-        <w:t>Matthew 5:10</w:t>
+        <w:t>Mark 1:15</w:t>
       </w:r>
     </w:p>
     <w:p>
@@ -427,7 +275,7 @@
         <w:rPr>
           <w:sz w:val="19"/>
         </w:rPr>
-        <w:t>Blessed are they who are persecuted for the sake of righteousness; for theirs is the Kingdom of heaven.</w:t>
+        <w:t>The Kingdom of God is at hand; repent and believe in the Gospel.</w:t>
       </w:r>
     </w:p>
     <w:p/>
@@ -456,7 +304,7 @@
           <w:color w:val="505050"/>
           <w:sz w:val="19"/>
         </w:rPr>
-        <w:t>Matthew 16:24-28</w:t>
+        <w:t>Luke 10:1-12</w:t>
       </w:r>
     </w:p>
     <w:p>
@@ -467,60 +315,7 @@
         <w:rPr>
           <w:sz w:val="19"/>
         </w:rPr>
-        <w:t>Jesus said to his disciples, “Whoever wishes to come after me must deny himself, take up his cross, and follow me. For whoever wishes to save his life will lose it, but whoever loses his life for my sake will find it. What profit would there be for one to gain the whole world and forfeit his life? Or what can one give in exchange for his life? For the Son of Man will come with his angels in his Father’s glory, and then he will repay each according to his conduct. Amen, I say to you, there are some standing here who will not taste death until they see the Son of Man coming in his Kingdom.”</w:t>
-      </w:r>
-    </w:p>
-    <w:p/>
-    <w:p>
-      <w:pPr>
-        <w:tabs>
-          <w:tab w:pos="6336" w:val="right"/>
-        </w:tabs>
-        <w:spacing w:before="80" w:after="40"/>
-      </w:pPr>
-      <w:r>
-        <w:rPr>
-          <w:b/>
-          <w:color w:val="000000"/>
-          <w:sz w:val="21"/>
-        </w:rPr>
-        <w:t>OFFERTORY HYMN / THÁNH CA TIẾN LỄ</w:t>
-      </w:r>
-    </w:p>
-    <w:p>
-      <w:pPr>
-        <w:spacing w:after="40"/>
-      </w:pPr>
-      <w:r>
-        <w:rPr>
-          <w:b/>
-          <w:sz w:val="19"/>
-        </w:rPr>
-        <w:t>Thánh Ca: Tiến Lễ Tin Yêu</w:t>
-      </w:r>
-    </w:p>
-    <w:p>
-      <w:pPr>
-        <w:spacing w:after="80"/>
-      </w:pPr>
-      <w:r>
-        <w:rPr>
-          <w:b/>
-          <w:sz w:val="19"/>
-        </w:rPr>
-        <w:t>ĐK. Con xin dâng lên bánh miến với rượu nho nồng...</w:t>
-      </w:r>
-    </w:p>
-    <w:p>
-      <w:pPr>
-        <w:spacing w:after="80" w:before="0"/>
-        <w:ind w:left="216"/>
-      </w:pPr>
-      <w:r>
-        <w:rPr>
-          <w:sz w:val="19"/>
-        </w:rPr>
-        <w:t>1. Từ muôn phương chúng con về đây dâng hiến...</w:t>
+        <w:t>Jesus appointed seventy-two other disciples whom he sent ahead of him in pairs to every town and place he intended to visit. He said to them, “The harvest is abundant but the laborers are few; so ask the master of the harvest to send out laborers for his harvest. Go on your way; behold, I am sending you like lambs among wolves. Carry no money bag, no sack, no sandals; and greet no one along the way. Into whatever house you enter, first say, ‘Peace to this household.’ If a peaceful person lives there, your peace will rest on him; but if not, it will return to you. Stay in the same house and eat and drink what is offered to you, for the laborer deserves his payment. Do not move about from one house to another. Whatever town you enter and they welcome you, eat what is set before you, cure the sick in it and say to them, ‘The Kingdom of God is at hand for you.’ Whatever town you enter and they do not receive you, go out into the streets and say, ‘The dust of your town that clings to our feet, even that we shake off against you.’ Yet know this: the Kingdom of God is at hand. I tell you, it will be more tolerable for Sodom on that day than for that town.”</w:t>
       </w:r>
     </w:p>
     <w:p/>

</xml_diff>